<commit_message>
Revert "Merge branch 'main' of https://github.com/sunsitox/Proyecto_Capston_Evento_Cultural"
This reverts commit d9e3e01149ff9690baee3e0c52b7e98d8ce1a245, reversing
changes made to 1b2bf7170d4da0a80b3ef54c3f065297f19d7403.
</commit_message>
<xml_diff>
--- a/Fase 1/Evidencias Grupales/1.5_GuiaEstudiante_Fase 1_Definicion Proyecto APT.docx
+++ b/Fase 1/Evidencias Grupales/1.5_GuiaEstudiante_Fase 1_Definicion Proyecto APT.docx
@@ -637,15 +637,12 @@
                 <w:color w:val="000000"/>
                 <w:rtl w:val="0"/>
               </w:rPr>
-              <w:t xml:space="preserve">Roberto </w:t>
-            </w:r>
-            <w:r>
-              <w:rPr>
-                <w:b w:val="1"/>
-                <w:bCs w:val="1"/>
-                <w:rtl w:val="0"/>
-              </w:rPr>
-              <w:t xml:space="preserve">Riffo Esteban Farias</w:t>
+              <w:t xml:space="preserve">Roberto</w:t>
+            </w:r>
+            <w:r>
+              <w:rPr>
+                <w:rtl w:val="0"/>
+              </w:rPr>
             </w:r>
           </w:p>
         </w:tc>
@@ -889,7 +886,7 @@
                 <w:bCs w:val="1"/>
                 <w:rtl w:val="0"/>
               </w:rPr>
-              <w:t xml:space="preserve">David Herrera Almonacid</w:t>
+              <w:t xml:space="preserve">David</w:t>
             </w:r>
           </w:p>
         </w:tc>
@@ -932,11 +929,8 @@
             </w:pPr>
             <w:r>
               <w:rPr>
-                <w:b w:val="1"/>
-                <w:bCs w:val="1"/>
-                <w:rtl w:val="0"/>
-              </w:rPr>
-              <w:t xml:space="preserve">21.198.967-K</w:t>
+                <w:rtl w:val="0"/>
+              </w:rPr>
             </w:r>
           </w:p>
         </w:tc>
@@ -2295,6 +2289,7 @@
                 <w:color w:val="548dd4"/>
                 <w:sz w:val="20"/>
                 <w:szCs w:val="20"/>
+                <w:highlight w:val="yellow"/>
               </w:rPr>
             </w:pPr>
             <w:r>
@@ -2308,39 +2303,6 @@
               </w:rPr>
               <w:t xml:space="preserve">¿Cuáles son tus intereses profesionales?  ¿Qué aspectos de tus intereses profesionales se ven reflejados en tu Proyecto APT? Realizar este Proyecto APT, ¿de qué manera va a contribuir a tu desarrollo profesional? </w:t>
             </w:r>
-          </w:p>
-          <w:p>
-            <w:pPr>
-              <w:jc w:val="both"/>
-              <w:rPr>
-                <w:i w:val="1"/>
-                <w:iCs w:val="1"/>
-                <w:sz w:val="20"/>
-                <w:szCs w:val="20"/>
-              </w:rPr>
-            </w:pPr>
-            <w:r>
-              <w:rPr>
-                <w:i w:val="1"/>
-                <w:iCs w:val="1"/>
-                <w:sz w:val="20"/>
-                <w:szCs w:val="20"/>
-                <w:rtl w:val="0"/>
-              </w:rPr>
-              <w:t xml:space="preserve">Nuestros intereses profesionales están relacionados en el desarrollo de aplicaciones móviles, el manejo de base de datos y la calidad de software, estos intereses se ven reflejados el proyecto APT, el cual las asignaturas vistas anteriormente se encargaron de fortalecer, este proyecto va a contribuir en el ámbito profesional el sentido de experiencia de desarrollos de aplicaciones moviles, toda esta  experiencia va a contribuir trabajando en equipo y prepararnos de mejor manera para futuros proyectos dentro del área de Ingeniería en Informática </w:t>
-            </w:r>
-          </w:p>
-          <w:p>
-            <w:pPr>
-              <w:jc w:val="both"/>
-              <w:rPr>
-                <w:i w:val="1"/>
-                <w:iCs w:val="1"/>
-                <w:color w:val="548dd4"/>
-                <w:sz w:val="20"/>
-                <w:szCs w:val="20"/>
-              </w:rPr>
-            </w:pPr>
             <w:r>
               <w:rPr>
                 <w:rtl w:val="0"/>
@@ -2561,54 +2523,6 @@
                 <w:rtl w:val="0"/>
               </w:rPr>
               <w:t xml:space="preserve">Factores externos que facilitan su desarrollo </w:t>
-            </w:r>
-          </w:p>
-          <w:p>
-            <w:pPr>
-              <w:pBdr>
-                <w:top w:space="0" w:sz="0" w:val="nil"/>
-                <w:left w:space="0" w:sz="0" w:val="nil"/>
-                <w:bottom w:space="0" w:sz="0" w:val="nil"/>
-                <w:right w:space="0" w:sz="0" w:val="nil"/>
-                <w:between w:space="0" w:sz="0" w:val="nil"/>
-              </w:pBdr>
-              <w:spacing w:after="0" w:lineRule="auto"/>
-              <w:rPr>
-                <w:i w:val="1"/>
-                <w:iCs w:val="1"/>
-                <w:color w:val="548dd4"/>
-                <w:sz w:val="20"/>
-                <w:szCs w:val="20"/>
-              </w:rPr>
-            </w:pPr>
-            <w:r>
-              <w:rPr>
-                <w:rtl w:val="0"/>
-              </w:rPr>
-            </w:r>
-          </w:p>
-          <w:p>
-            <w:pPr>
-              <w:pBdr>
-                <w:top w:space="0" w:sz="0" w:val="nil"/>
-                <w:left w:space="0" w:sz="0" w:val="nil"/>
-                <w:bottom w:space="0" w:sz="0" w:val="nil"/>
-                <w:right w:space="0" w:sz="0" w:val="nil"/>
-                <w:between w:space="0" w:sz="0" w:val="nil"/>
-              </w:pBdr>
-              <w:spacing w:after="0" w:lineRule="auto"/>
-              <w:rPr>
-                <w:i w:val="1"/>
-                <w:iCs w:val="1"/>
-                <w:color w:val="548dd4"/>
-                <w:sz w:val="20"/>
-                <w:szCs w:val="20"/>
-              </w:rPr>
-            </w:pPr>
-            <w:r>
-              <w:rPr>
-                <w:rtl w:val="0"/>
-              </w:rPr>
             </w:r>
           </w:p>
           <w:p>

</xml_diff>

<commit_message>
Reapply "Merge branch 'main' of https://github.com/sunsitox/Proyecto_Capston_Evento_Cultural"
This reverts commit 7579e09f4132d847c49e387b08504bdefa805b11.
</commit_message>
<xml_diff>
--- a/Fase 1/Evidencias Grupales/1.5_GuiaEstudiante_Fase 1_Definicion Proyecto APT.docx
+++ b/Fase 1/Evidencias Grupales/1.5_GuiaEstudiante_Fase 1_Definicion Proyecto APT.docx
@@ -637,12 +637,15 @@
                 <w:color w:val="000000"/>
                 <w:rtl w:val="0"/>
               </w:rPr>
-              <w:t xml:space="preserve">Roberto</w:t>
-            </w:r>
-            <w:r>
-              <w:rPr>
-                <w:rtl w:val="0"/>
-              </w:rPr>
+              <w:t xml:space="preserve">Roberto </w:t>
+            </w:r>
+            <w:r>
+              <w:rPr>
+                <w:b w:val="1"/>
+                <w:bCs w:val="1"/>
+                <w:rtl w:val="0"/>
+              </w:rPr>
+              <w:t xml:space="preserve">Riffo Esteban Farias</w:t>
             </w:r>
           </w:p>
         </w:tc>
@@ -886,7 +889,7 @@
                 <w:bCs w:val="1"/>
                 <w:rtl w:val="0"/>
               </w:rPr>
-              <w:t xml:space="preserve">David</w:t>
+              <w:t xml:space="preserve">David Herrera Almonacid</w:t>
             </w:r>
           </w:p>
         </w:tc>
@@ -929,8 +932,11 @@
             </w:pPr>
             <w:r>
               <w:rPr>
-                <w:rtl w:val="0"/>
-              </w:rPr>
+                <w:b w:val="1"/>
+                <w:bCs w:val="1"/>
+                <w:rtl w:val="0"/>
+              </w:rPr>
+              <w:t xml:space="preserve">21.198.967-K</w:t>
             </w:r>
           </w:p>
         </w:tc>
@@ -2289,7 +2295,6 @@
                 <w:color w:val="548dd4"/>
                 <w:sz w:val="20"/>
                 <w:szCs w:val="20"/>
-                <w:highlight w:val="yellow"/>
               </w:rPr>
             </w:pPr>
             <w:r>
@@ -2303,6 +2308,39 @@
               </w:rPr>
               <w:t xml:space="preserve">¿Cuáles son tus intereses profesionales?  ¿Qué aspectos de tus intereses profesionales se ven reflejados en tu Proyecto APT? Realizar este Proyecto APT, ¿de qué manera va a contribuir a tu desarrollo profesional? </w:t>
             </w:r>
+          </w:p>
+          <w:p>
+            <w:pPr>
+              <w:jc w:val="both"/>
+              <w:rPr>
+                <w:i w:val="1"/>
+                <w:iCs w:val="1"/>
+                <w:sz w:val="20"/>
+                <w:szCs w:val="20"/>
+              </w:rPr>
+            </w:pPr>
+            <w:r>
+              <w:rPr>
+                <w:i w:val="1"/>
+                <w:iCs w:val="1"/>
+                <w:sz w:val="20"/>
+                <w:szCs w:val="20"/>
+                <w:rtl w:val="0"/>
+              </w:rPr>
+              <w:t xml:space="preserve">Nuestros intereses profesionales están relacionados en el desarrollo de aplicaciones móviles, el manejo de base de datos y la calidad de software, estos intereses se ven reflejados el proyecto APT, el cual las asignaturas vistas anteriormente se encargaron de fortalecer, este proyecto va a contribuir en el ámbito profesional el sentido de experiencia de desarrollos de aplicaciones moviles, toda esta  experiencia va a contribuir trabajando en equipo y prepararnos de mejor manera para futuros proyectos dentro del área de Ingeniería en Informática </w:t>
+            </w:r>
+          </w:p>
+          <w:p>
+            <w:pPr>
+              <w:jc w:val="both"/>
+              <w:rPr>
+                <w:i w:val="1"/>
+                <w:iCs w:val="1"/>
+                <w:color w:val="548dd4"/>
+                <w:sz w:val="20"/>
+                <w:szCs w:val="20"/>
+              </w:rPr>
+            </w:pPr>
             <w:r>
               <w:rPr>
                 <w:rtl w:val="0"/>
@@ -2523,6 +2561,54 @@
                 <w:rtl w:val="0"/>
               </w:rPr>
               <w:t xml:space="preserve">Factores externos que facilitan su desarrollo </w:t>
+            </w:r>
+          </w:p>
+          <w:p>
+            <w:pPr>
+              <w:pBdr>
+                <w:top w:space="0" w:sz="0" w:val="nil"/>
+                <w:left w:space="0" w:sz="0" w:val="nil"/>
+                <w:bottom w:space="0" w:sz="0" w:val="nil"/>
+                <w:right w:space="0" w:sz="0" w:val="nil"/>
+                <w:between w:space="0" w:sz="0" w:val="nil"/>
+              </w:pBdr>
+              <w:spacing w:after="0" w:lineRule="auto"/>
+              <w:rPr>
+                <w:i w:val="1"/>
+                <w:iCs w:val="1"/>
+                <w:color w:val="548dd4"/>
+                <w:sz w:val="20"/>
+                <w:szCs w:val="20"/>
+              </w:rPr>
+            </w:pPr>
+            <w:r>
+              <w:rPr>
+                <w:rtl w:val="0"/>
+              </w:rPr>
+            </w:r>
+          </w:p>
+          <w:p>
+            <w:pPr>
+              <w:pBdr>
+                <w:top w:space="0" w:sz="0" w:val="nil"/>
+                <w:left w:space="0" w:sz="0" w:val="nil"/>
+                <w:bottom w:space="0" w:sz="0" w:val="nil"/>
+                <w:right w:space="0" w:sz="0" w:val="nil"/>
+                <w:between w:space="0" w:sz="0" w:val="nil"/>
+              </w:pBdr>
+              <w:spacing w:after="0" w:lineRule="auto"/>
+              <w:rPr>
+                <w:i w:val="1"/>
+                <w:iCs w:val="1"/>
+                <w:color w:val="548dd4"/>
+                <w:sz w:val="20"/>
+                <w:szCs w:val="20"/>
+              </w:rPr>
+            </w:pPr>
+            <w:r>
+              <w:rPr>
+                <w:rtl w:val="0"/>
+              </w:rPr>
             </w:r>
           </w:p>
           <w:p>

</xml_diff>